<commit_message>
[DCL-93] Updates to outline
</commit_message>
<xml_diff>
--- a/docs/paper/draft0.docx
+++ b/docs/paper/draft0.docx
@@ -15,7 +15,14 @@
           <w:sz w:val="36"/>
           <w:szCs w:val="36"/>
         </w:rPr>
-        <w:t xml:space="preserve">Explaining AI </w:t>
+        <w:t>Explaining</w:t>
+      </w:r>
+      <w:r>
+        <w:rPr>
+          <w:sz w:val="36"/>
+          <w:szCs w:val="36"/>
+        </w:rPr>
+        <w:t xml:space="preserve"> AI </w:t>
       </w:r>
       <w:r>
         <w:rPr>
@@ -52,13 +59,6 @@
           <w:sz w:val="36"/>
           <w:szCs w:val="36"/>
         </w:rPr>
-        <w:t xml:space="preserve">Dumb </w:t>
-      </w:r>
-      <w:r>
-        <w:rPr>
-          <w:sz w:val="36"/>
-          <w:szCs w:val="36"/>
-        </w:rPr>
         <w:t>Hyper-Manifolds</w:t>
       </w:r>
       <w:r>
@@ -294,10 +294,13 @@
         <w:pStyle w:val="Heading1"/>
       </w:pPr>
       <w:r>
-        <w:t>Interpreting</w:t>
-      </w:r>
-      <w:r>
-        <w:t xml:space="preserve"> a Dumb Manifold</w:t>
+        <w:t>Visualizing the</w:t>
+      </w:r>
+      <w:r>
+        <w:t xml:space="preserve"> Knowledge Contained in a</w:t>
+      </w:r>
+      <w:r>
+        <w:t xml:space="preserve"> Hyper-Manifold</w:t>
       </w:r>
     </w:p>
     <w:p/>
@@ -306,7 +309,7 @@
         <w:pStyle w:val="Heading4"/>
       </w:pPr>
       <w:r>
-        <w:t>Why Dumb Manifolds Aren’t Smart</w:t>
+        <w:t>Valid Positions</w:t>
       </w:r>
     </w:p>
     <w:p/>
@@ -316,7 +319,10 @@
       </w:pPr>
       <w:r>
         <w:lastRenderedPageBreak/>
-        <w:t>Matrix Polling for Knowledge Verification</w:t>
+        <w:t>Valid Velocit</w:t>
+      </w:r>
+      <w:r>
+        <w:t>ies</w:t>
       </w:r>
     </w:p>
     <w:p/>
@@ -344,15 +350,6 @@
       </w:pPr>
       <w:r>
         <w:t>Conversion Kit</w:t>
-      </w:r>
-    </w:p>
-    <w:p/>
-    <w:p>
-      <w:pPr>
-        <w:pStyle w:val="Heading4"/>
-      </w:pPr>
-      <w:r>
-        <w:t>IDW is a Smart Manifold Solution Process</w:t>
       </w:r>
     </w:p>
     <w:p/>

</xml_diff>